<commit_message>
docs(evidencias): capturas de Azure DevOps insertadas en el plan de pruebas
</commit_message>
<xml_diff>
--- a/docs/plan-de-pruebas.docx
+++ b/docs/plan-de-pruebas.docx
@@ -7131,486 +7131,542 @@
         <w:t>A continuación se presentan los espacios diagramados para anexar las capturas de pantalla de Azure DevOps solicitadas en las indicaciones del docente, organizadas por integrante:</w:t>
       </w:r>
     </w:p>
-    <w:tbl>
-      <w:tblPr>
-        <w:tblW w:w="9360" w:type="dxa"/>
-        <w:tblBorders>
-          <w:top w:val="dashed" w:sz="12" w:space="0" w:color="0078D4"/>
-          <w:left w:val="dashed" w:sz="12" w:space="0" w:color="0078D4"/>
-          <w:bottom w:val="dashed" w:sz="12" w:space="0" w:color="0078D4"/>
-          <w:right w:val="dashed" w:sz="12" w:space="0" w:color="0078D4"/>
-          <w:insideH w:val="none"/>
-          <w:insideV w:val="none"/>
-        </w:tblBorders>
-      </w:tblPr>
-      <w:tr>
-        <w:tc>
-          <w:tcPr>
-            <w:tcW w:w="9360" w:type="dxa"/>
-            <w:shd w:val="clear" w:color="auto" w:fill="F0F6FC"/>
-            <w:tcMar>
-              <w:top w:w="240" w:type="dxa"/>
-              <w:bottom w:w="240" w:type="dxa"/>
-              <w:left w:w="300" w:type="dxa"/>
-              <w:right w:w="300" w:type="dxa"/>
-            </w:tcMar>
-          </w:tcPr>
-          <w:p>
-            <w:pPr>
-              <w:jc w:val="center"/>
-              <w:spacing w:after="80"/>
-            </w:pPr>
-            <w:r>
-              <w:rPr>
-                <w:b/>
-                <w:color w:val="005A9E"/>
-                <w:sz w:val="22"/>
-              </w:rPr>
-              <w:t>[ 📷 ESPACIO PARA CAPTURA 1: PRODUCT BACKLOG ITEMS (PBIS) EN AZURE DEVOPS BOARDS ]</w:t>
-            </w:r>
-          </w:p>
-          <w:p>
-            <w:pPr>
-              <w:jc w:val="center"/>
-              <w:spacing w:after="60"/>
-            </w:pPr>
-            <w:r>
-              <w:rPr>
-                <w:i/>
-                <w:color w:val="24292F"/>
-              </w:rPr>
-              <w:t>Vista del Backlog del proyecto FutsalPro mostrando los PBIs (#101, #102, #103, #104, #105, #106) asignados en el Sprint 1.</w:t>
-            </w:r>
-          </w:p>
-          <w:p>
-            <w:pPr>
-              <w:jc w:val="center"/>
-              <w:spacing w:after="80"/>
-            </w:pPr>
-            <w:r>
-              <w:rPr>
-                <w:b/>
-                <w:color w:val="0969DA"/>
-              </w:rPr>
-              <w:t>👤 Integrante Responsable: ANDERSON RAFAEL PINEDA FLORES (Líder)</w:t>
-            </w:r>
-          </w:p>
-          <w:p>
-            <w:pPr>
-              <w:jc w:val="center"/>
-              <w:spacing w:after="160"/>
-            </w:pPr>
-            <w:r>
-              <w:rPr>
-                <w:color w:val="57606A"/>
-                <w:sz w:val="18"/>
-              </w:rPr>
-              <w:t>Instrucción para el equipo: Ingresar a Azure DevOps &gt; Boards &gt; Backlogs. Capturar la tabla general con las asignaciones de los 4 integrantes.</w:t>
-            </w:r>
-          </w:p>
-          <w:p>
-            <w:pPr>
-              <w:jc w:val="center"/>
-              <w:spacing w:after="0"/>
-            </w:pPr>
-            <w:r>
-              <w:rPr>
-                <w:color w:val="8C959F"/>
-              </w:rPr>
-              <w:t>[ Pegar aquí la captura de pantalla de Azure DevOps correspondiente ]</w:t>
-            </w:r>
-          </w:p>
-        </w:tc>
-      </w:tr>
-    </w:tbl>
+    <w:p>
+      <w:r>
+        <w:rPr>
+          <w:b/>
+          <w:i w:val="0"/>
+          <w:sz w:val="24"/>
+        </w:rPr>
+        <w:t>Evidencia 1 — Product Backlog Items en Azure Boards</w:t>
+      </w:r>
+    </w:p>
+    <w:p>
+      <w:pPr>
+        <w:jc w:val="center"/>
+      </w:pPr>
+      <w:r>
+        <w:drawing>
+          <wp:inline xmlns:a="http://schemas.openxmlformats.org/drawingml/2006/main" xmlns:pic="http://schemas.openxmlformats.org/drawingml/2006/picture">
+            <wp:extent cx="5760720" cy="1536192"/>
+            <wp:docPr id="9" name="Picture 9"/>
+            <wp:cNvGraphicFramePr>
+              <a:graphicFrameLocks noChangeAspect="1"/>
+            </wp:cNvGraphicFramePr>
+            <a:graphic>
+              <a:graphicData uri="http://schemas.openxmlformats.org/drawingml/2006/picture">
+                <pic:pic>
+                  <pic:nvPicPr>
+                    <pic:cNvPr id="0" name="01_backlog_pbis.png"/>
+                    <pic:cNvPicPr/>
+                  </pic:nvPicPr>
+                  <pic:blipFill>
+                    <a:blip r:embed="rId19"/>
+                    <a:stretch>
+                      <a:fillRect/>
+                    </a:stretch>
+                  </pic:blipFill>
+                  <pic:spPr>
+                    <a:xfrm>
+                      <a:off x="0" y="0"/>
+                      <a:ext cx="5760720" cy="1536192"/>
+                    </a:xfrm>
+                    <a:prstGeom prst="rect"/>
+                  </pic:spPr>
+                </pic:pic>
+              </a:graphicData>
+            </a:graphic>
+          </wp:inline>
+        </w:drawing>
+      </w:r>
+    </w:p>
+    <w:p>
+      <w:pPr>
+        <w:jc w:val="center"/>
+      </w:pPr>
+      <w:r>
+        <w:rPr>
+          <w:b w:val="0"/>
+          <w:i/>
+          <w:sz w:val="18"/>
+        </w:rPr>
+        <w:t>Figura 1. Backlog de Product Backlog Items del Sprint 1 en Azure Boards.</w:t>
+      </w:r>
+    </w:p>
+    <w:p>
+      <w:r>
+        <w:rPr>
+          <w:b w:val="0"/>
+          <w:i w:val="0"/>
+        </w:rPr>
+      </w:r>
+    </w:p>
     <w:p>
       <w:pPr>
         <w:spacing w:after="140" w:line="276" w:lineRule="auto"/>
       </w:pPr>
     </w:p>
-    <w:tbl>
-      <w:tblPr>
-        <w:tblW w:w="9360" w:type="dxa"/>
-        <w:tblBorders>
-          <w:top w:val="dashed" w:sz="12" w:space="0" w:color="0078D4"/>
-          <w:left w:val="dashed" w:sz="12" w:space="0" w:color="0078D4"/>
-          <w:bottom w:val="dashed" w:sz="12" w:space="0" w:color="0078D4"/>
-          <w:right w:val="dashed" w:sz="12" w:space="0" w:color="0078D4"/>
-          <w:insideH w:val="none"/>
-          <w:insideV w:val="none"/>
-        </w:tblBorders>
-      </w:tblPr>
-      <w:tr>
-        <w:tc>
-          <w:tcPr>
-            <w:tcW w:w="9360" w:type="dxa"/>
-            <w:shd w:val="clear" w:color="auto" w:fill="F0F6FC"/>
-            <w:tcMar>
-              <w:top w:w="240" w:type="dxa"/>
-              <w:bottom w:w="240" w:type="dxa"/>
-              <w:left w:w="300" w:type="dxa"/>
-              <w:right w:w="300" w:type="dxa"/>
-            </w:tcMar>
-          </w:tcPr>
-          <w:p>
-            <w:pPr>
-              <w:jc w:val="center"/>
-              <w:spacing w:after="80"/>
-            </w:pPr>
-            <w:r>
-              <w:rPr>
-                <w:b/>
-                <w:color w:val="005A9E"/>
-                <w:sz w:val="22"/>
-              </w:rPr>
-              <w:t>[ 📷 ESPACIO PARA CAPTURA 2: DETALLE DE PBI #101 (RESERVAS) Y PBI #102 (CANCELACIÓN JUSTIFICADA) ]</w:t>
-            </w:r>
-          </w:p>
-          <w:p>
-            <w:pPr>
-              <w:jc w:val="center"/>
-              <w:spacing w:after="60"/>
-            </w:pPr>
-            <w:r>
-              <w:rPr>
-                <w:i/>
-                <w:color w:val="24292F"/>
-              </w:rPr>
-              <w:t>Vista del PBI de Reservas y Cancelaciones desplegando Criterios de Aceptación Given-When-Then y Test Cases vinculados (1001 a 1010).</w:t>
-            </w:r>
-          </w:p>
-          <w:p>
-            <w:pPr>
-              <w:jc w:val="center"/>
-              <w:spacing w:after="80"/>
-            </w:pPr>
-            <w:r>
-              <w:rPr>
-                <w:b/>
-                <w:color w:val="0969DA"/>
-              </w:rPr>
-              <w:t>👤 Integrante Responsable: ANDERSON PINEDA / CARLOS PÉREZ SHUPAN</w:t>
-            </w:r>
-          </w:p>
-          <w:p>
-            <w:pPr>
-              <w:jc w:val="center"/>
-              <w:spacing w:after="160"/>
-            </w:pPr>
-            <w:r>
-              <w:rPr>
-                <w:color w:val="57606A"/>
-                <w:sz w:val="18"/>
-              </w:rPr>
-              <w:t>Instrucción para el equipo: Abrir PBI #101 o #102 en Azure Boards y capturar formulario con Acceptance Criteria y enlaces a Test Cases.</w:t>
-            </w:r>
-          </w:p>
-          <w:p>
-            <w:pPr>
-              <w:jc w:val="center"/>
-              <w:spacing w:after="0"/>
-            </w:pPr>
-            <w:r>
-              <w:rPr>
-                <w:color w:val="8C959F"/>
-              </w:rPr>
-              <w:t>[ Pegar aquí la captura de pantalla de Azure DevOps correspondiente ]</w:t>
-            </w:r>
-          </w:p>
-        </w:tc>
-      </w:tr>
-    </w:tbl>
+    <w:p>
+      <w:r>
+        <w:rPr>
+          <w:b/>
+          <w:i w:val="0"/>
+          <w:sz w:val="24"/>
+        </w:rPr>
+        <w:t>Evidencia 2 — Detalle de PBI #101 (Reservas) y PBI #102 (Cancelación)</w:t>
+      </w:r>
+    </w:p>
+    <w:p>
+      <w:pPr>
+        <w:jc w:val="center"/>
+      </w:pPr>
+      <w:r>
+        <w:drawing>
+          <wp:inline xmlns:a="http://schemas.openxmlformats.org/drawingml/2006/main" xmlns:pic="http://schemas.openxmlformats.org/drawingml/2006/picture">
+            <wp:extent cx="5760720" cy="4136917"/>
+            <wp:docPr id="10" name="Picture 10"/>
+            <wp:cNvGraphicFramePr>
+              <a:graphicFrameLocks noChangeAspect="1"/>
+            </wp:cNvGraphicFramePr>
+            <a:graphic>
+              <a:graphicData uri="http://schemas.openxmlformats.org/drawingml/2006/picture">
+                <pic:pic>
+                  <pic:nvPicPr>
+                    <pic:cNvPr id="0" name="02_pbi101_reservas.png"/>
+                    <pic:cNvPicPr/>
+                  </pic:nvPicPr>
+                  <pic:blipFill>
+                    <a:blip r:embed="rId20"/>
+                    <a:stretch>
+                      <a:fillRect/>
+                    </a:stretch>
+                  </pic:blipFill>
+                  <pic:spPr>
+                    <a:xfrm>
+                      <a:off x="0" y="0"/>
+                      <a:ext cx="5760720" cy="4136917"/>
+                    </a:xfrm>
+                    <a:prstGeom prst="rect"/>
+                  </pic:spPr>
+                </pic:pic>
+              </a:graphicData>
+            </a:graphic>
+          </wp:inline>
+        </w:drawing>
+      </w:r>
+    </w:p>
+    <w:p>
+      <w:pPr>
+        <w:jc w:val="center"/>
+      </w:pPr>
+      <w:r>
+        <w:rPr>
+          <w:b w:val="0"/>
+          <w:i/>
+          <w:sz w:val="18"/>
+        </w:rPr>
+        <w:t>Figura 2a. PBI #101 (ID 30): criterios de aceptación y casos de prueba vinculados.</w:t>
+      </w:r>
+    </w:p>
+    <w:p>
+      <w:pPr>
+        <w:jc w:val="center"/>
+      </w:pPr>
+      <w:r>
+        <w:drawing>
+          <wp:inline xmlns:a="http://schemas.openxmlformats.org/drawingml/2006/main" xmlns:pic="http://schemas.openxmlformats.org/drawingml/2006/picture">
+            <wp:extent cx="5760720" cy="4136917"/>
+            <wp:docPr id="11" name="Picture 11"/>
+            <wp:cNvGraphicFramePr>
+              <a:graphicFrameLocks noChangeAspect="1"/>
+            </wp:cNvGraphicFramePr>
+            <a:graphic>
+              <a:graphicData uri="http://schemas.openxmlformats.org/drawingml/2006/picture">
+                <pic:pic>
+                  <pic:nvPicPr>
+                    <pic:cNvPr id="0" name="03_pbi102_cancelacion.png"/>
+                    <pic:cNvPicPr/>
+                  </pic:nvPicPr>
+                  <pic:blipFill>
+                    <a:blip r:embed="rId21"/>
+                    <a:stretch>
+                      <a:fillRect/>
+                    </a:stretch>
+                  </pic:blipFill>
+                  <pic:spPr>
+                    <a:xfrm>
+                      <a:off x="0" y="0"/>
+                      <a:ext cx="5760720" cy="4136917"/>
+                    </a:xfrm>
+                    <a:prstGeom prst="rect"/>
+                  </pic:spPr>
+                </pic:pic>
+              </a:graphicData>
+            </a:graphic>
+          </wp:inline>
+        </w:drawing>
+      </w:r>
+    </w:p>
+    <w:p>
+      <w:pPr>
+        <w:jc w:val="center"/>
+      </w:pPr>
+      <w:r>
+        <w:rPr>
+          <w:b w:val="0"/>
+          <w:i/>
+          <w:sz w:val="18"/>
+        </w:rPr>
+        <w:t>Figura 2b. PBI #102 (ID 31): cancelación de reservas con justificación obligatoria.</w:t>
+      </w:r>
+    </w:p>
+    <w:p>
+      <w:r>
+        <w:rPr>
+          <w:b w:val="0"/>
+          <w:i w:val="0"/>
+        </w:rPr>
+      </w:r>
+    </w:p>
     <w:p>
       <w:pPr>
         <w:spacing w:after="140" w:line="276" w:lineRule="auto"/>
       </w:pPr>
     </w:p>
-    <w:tbl>
-      <w:tblPr>
-        <w:tblW w:w="9360" w:type="dxa"/>
-        <w:tblBorders>
-          <w:top w:val="dashed" w:sz="12" w:space="0" w:color="0078D4"/>
-          <w:left w:val="dashed" w:sz="12" w:space="0" w:color="0078D4"/>
-          <w:bottom w:val="dashed" w:sz="12" w:space="0" w:color="0078D4"/>
-          <w:right w:val="dashed" w:sz="12" w:space="0" w:color="0078D4"/>
-          <w:insideH w:val="none"/>
-          <w:insideV w:val="none"/>
-        </w:tblBorders>
-      </w:tblPr>
-      <w:tr>
-        <w:tc>
-          <w:tcPr>
-            <w:tcW w:w="9360" w:type="dxa"/>
-            <w:shd w:val="clear" w:color="auto" w:fill="F0F6FC"/>
-            <w:tcMar>
-              <w:top w:w="240" w:type="dxa"/>
-              <w:bottom w:w="240" w:type="dxa"/>
-              <w:left w:w="300" w:type="dxa"/>
-              <w:right w:w="300" w:type="dxa"/>
-            </w:tcMar>
-          </w:tcPr>
-          <w:p>
-            <w:pPr>
-              <w:jc w:val="center"/>
-              <w:spacing w:after="80"/>
-            </w:pPr>
-            <w:r>
-              <w:rPr>
-                <w:b/>
-                <w:color w:val="005A9E"/>
-                <w:sz w:val="22"/>
-              </w:rPr>
-              <w:t>[ 📷 ESPACIO PARA CAPTURA 3: DETALLE DE PBI #103 (TORNEOS FIXTURE) Y PBI #104 (MARCADORES ARBITRALES) ]</w:t>
-            </w:r>
-          </w:p>
-          <w:p>
-            <w:pPr>
-              <w:jc w:val="center"/>
-              <w:spacing w:after="60"/>
-            </w:pPr>
-            <w:r>
-              <w:rPr>
-                <w:i/>
-                <w:color w:val="24292F"/>
-              </w:rPr>
-              <w:t>Vista del PBI de Torneos de Fútbol Sala con reglas de anticipación (15-30 días), Cuartos de Final, Byes impares y marcadores.</w:t>
-            </w:r>
-          </w:p>
-          <w:p>
-            <w:pPr>
-              <w:jc w:val="center"/>
-              <w:spacing w:after="80"/>
-            </w:pPr>
-            <w:r>
-              <w:rPr>
-                <w:b/>
-                <w:color w:val="0969DA"/>
-              </w:rPr>
-              <w:t>👤 Integrante Responsable: FRANKLIN PÉREZ CERÉN / DAX ASCENCIO GUEVARA</w:t>
-            </w:r>
-          </w:p>
-          <w:p>
-            <w:pPr>
-              <w:jc w:val="center"/>
-              <w:spacing w:after="160"/>
-            </w:pPr>
-            <w:r>
-              <w:rPr>
-                <w:color w:val="57606A"/>
-                <w:sz w:val="18"/>
-              </w:rPr>
-              <w:t>Instrucción para el equipo: Abrir PBI #103 o #104 en Azure DevOps y capturar el formulario con criterios de aceptación y tareas de testing.</w:t>
-            </w:r>
-          </w:p>
-          <w:p>
-            <w:pPr>
-              <w:jc w:val="center"/>
-              <w:spacing w:after="0"/>
-            </w:pPr>
-            <w:r>
-              <w:rPr>
-                <w:color w:val="8C959F"/>
-              </w:rPr>
-              <w:t>[ Pegar aquí la captura de pantalla de Azure DevOps correspondiente ]</w:t>
-            </w:r>
-          </w:p>
-        </w:tc>
-      </w:tr>
-    </w:tbl>
+    <w:p>
+      <w:r>
+        <w:rPr>
+          <w:b/>
+          <w:i w:val="0"/>
+          <w:sz w:val="24"/>
+        </w:rPr>
+        <w:t>Evidencia 3 — Detalle de PBI #103 (Torneos) y PBI #104 (Marcadores)</w:t>
+      </w:r>
+    </w:p>
+    <w:p>
+      <w:pPr>
+        <w:jc w:val="center"/>
+      </w:pPr>
+      <w:r>
+        <w:drawing>
+          <wp:inline xmlns:a="http://schemas.openxmlformats.org/drawingml/2006/main" xmlns:pic="http://schemas.openxmlformats.org/drawingml/2006/picture">
+            <wp:extent cx="5760720" cy="4136917"/>
+            <wp:docPr id="12" name="Picture 12"/>
+            <wp:cNvGraphicFramePr>
+              <a:graphicFrameLocks noChangeAspect="1"/>
+            </wp:cNvGraphicFramePr>
+            <a:graphic>
+              <a:graphicData uri="http://schemas.openxmlformats.org/drawingml/2006/picture">
+                <pic:pic>
+                  <pic:nvPicPr>
+                    <pic:cNvPr id="0" name="04_pbi103_torneos.png"/>
+                    <pic:cNvPicPr/>
+                  </pic:nvPicPr>
+                  <pic:blipFill>
+                    <a:blip r:embed="rId22"/>
+                    <a:stretch>
+                      <a:fillRect/>
+                    </a:stretch>
+                  </pic:blipFill>
+                  <pic:spPr>
+                    <a:xfrm>
+                      <a:off x="0" y="0"/>
+                      <a:ext cx="5760720" cy="4136917"/>
+                    </a:xfrm>
+                    <a:prstGeom prst="rect"/>
+                  </pic:spPr>
+                </pic:pic>
+              </a:graphicData>
+            </a:graphic>
+          </wp:inline>
+        </w:drawing>
+      </w:r>
+    </w:p>
+    <w:p>
+      <w:pPr>
+        <w:jc w:val="center"/>
+      </w:pPr>
+      <w:r>
+        <w:rPr>
+          <w:b w:val="0"/>
+          <w:i/>
+          <w:sz w:val="18"/>
+        </w:rPr>
+        <w:t>Figura 3a. PBI #103 (ID 32): torneos y fixture automático de Cuartos de Final.</w:t>
+      </w:r>
+    </w:p>
+    <w:p>
+      <w:pPr>
+        <w:jc w:val="center"/>
+      </w:pPr>
+      <w:r>
+        <w:drawing>
+          <wp:inline xmlns:a="http://schemas.openxmlformats.org/drawingml/2006/main" xmlns:pic="http://schemas.openxmlformats.org/drawingml/2006/picture">
+            <wp:extent cx="5760720" cy="4136917"/>
+            <wp:docPr id="13" name="Picture 13"/>
+            <wp:cNvGraphicFramePr>
+              <a:graphicFrameLocks noChangeAspect="1"/>
+            </wp:cNvGraphicFramePr>
+            <a:graphic>
+              <a:graphicData uri="http://schemas.openxmlformats.org/drawingml/2006/picture">
+                <pic:pic>
+                  <pic:nvPicPr>
+                    <pic:cNvPr id="0" name="05_pbi104_marcadores.png"/>
+                    <pic:cNvPicPr/>
+                  </pic:nvPicPr>
+                  <pic:blipFill>
+                    <a:blip r:embed="rId23"/>
+                    <a:stretch>
+                      <a:fillRect/>
+                    </a:stretch>
+                  </pic:blipFill>
+                  <pic:spPr>
+                    <a:xfrm>
+                      <a:off x="0" y="0"/>
+                      <a:ext cx="5760720" cy="4136917"/>
+                    </a:xfrm>
+                    <a:prstGeom prst="rect"/>
+                  </pic:spPr>
+                </pic:pic>
+              </a:graphicData>
+            </a:graphic>
+          </wp:inline>
+        </w:drawing>
+      </w:r>
+    </w:p>
+    <w:p>
+      <w:pPr>
+        <w:jc w:val="center"/>
+      </w:pPr>
+      <w:r>
+        <w:rPr>
+          <w:b w:val="0"/>
+          <w:i/>
+          <w:sz w:val="18"/>
+        </w:rPr>
+        <w:t>Figura 3b. PBI #104 (ID 33): registro de marcadores arbitrales y ganadores.</w:t>
+      </w:r>
+    </w:p>
+    <w:p>
+      <w:r>
+        <w:rPr>
+          <w:b w:val="0"/>
+          <w:i w:val="0"/>
+        </w:rPr>
+      </w:r>
+    </w:p>
     <w:p>
       <w:pPr>
         <w:spacing w:after="140" w:line="276" w:lineRule="auto"/>
       </w:pPr>
     </w:p>
-    <w:tbl>
-      <w:tblPr>
-        <w:tblW w:w="9360" w:type="dxa"/>
-        <w:tblBorders>
-          <w:top w:val="dashed" w:sz="12" w:space="0" w:color="0078D4"/>
-          <w:left w:val="dashed" w:sz="12" w:space="0" w:color="0078D4"/>
-          <w:bottom w:val="dashed" w:sz="12" w:space="0" w:color="0078D4"/>
-          <w:right w:val="dashed" w:sz="12" w:space="0" w:color="0078D4"/>
-          <w:insideH w:val="none"/>
-          <w:insideV w:val="none"/>
-        </w:tblBorders>
-      </w:tblPr>
-      <w:tr>
-        <w:tc>
-          <w:tcPr>
-            <w:tcW w:w="9360" w:type="dxa"/>
-            <w:shd w:val="clear" w:color="auto" w:fill="F0F6FC"/>
-            <w:tcMar>
-              <w:top w:w="240" w:type="dxa"/>
-              <w:bottom w:w="240" w:type="dxa"/>
-              <w:left w:w="300" w:type="dxa"/>
-              <w:right w:w="300" w:type="dxa"/>
-            </w:tcMar>
-          </w:tcPr>
-          <w:p>
-            <w:pPr>
-              <w:jc w:val="center"/>
-              <w:spacing w:after="80"/>
-            </w:pPr>
-            <w:r>
-              <w:rPr>
-                <w:b/>
-                <w:color w:val="005A9E"/>
-                <w:sz w:val="22"/>
-              </w:rPr>
-              <w:t>[ 📷 ESPACIO PARA CAPTURA 4: PLAN DE PRUEBAS Y TEST SUITES EN AZURE TEST PLANS ]</w:t>
-            </w:r>
-          </w:p>
-          <w:p>
-            <w:pPr>
-              <w:jc w:val="center"/>
-              <w:spacing w:after="60"/>
-            </w:pPr>
-            <w:r>
-              <w:rPr>
-                <w:i/>
-                <w:color w:val="24292F"/>
-              </w:rPr>
-              <w:t>Estructura del Test Plan 'FutsalPro-Sprint1' mostrando las suites de Pruebas Unitarias, API REST y Aceptación con sus casos asignados a cada integrante.</w:t>
-            </w:r>
-          </w:p>
-          <w:p>
-            <w:pPr>
-              <w:jc w:val="center"/>
-              <w:spacing w:after="80"/>
-            </w:pPr>
-            <w:r>
-              <w:rPr>
-                <w:b/>
-                <w:color w:val="0969DA"/>
-              </w:rPr>
-              <w:t>👤 Integrante Responsable: FRANKLIN PÉREZ CERÉN / ANDERSON PINEDA</w:t>
-            </w:r>
-          </w:p>
-          <w:p>
-            <w:pPr>
-              <w:jc w:val="center"/>
-              <w:spacing w:after="160"/>
-            </w:pPr>
-            <w:r>
-              <w:rPr>
-                <w:color w:val="57606A"/>
-                <w:sz w:val="18"/>
-              </w:rPr>
-              <w:t>Instrucción para el equipo: Navegar a Azure DevOps &gt; Test Plans &gt; Define o Progress Report. Capturar el árbol de Test Suites y lista de Test Cases.</w:t>
-            </w:r>
-          </w:p>
-          <w:p>
-            <w:pPr>
-              <w:jc w:val="center"/>
-              <w:spacing w:after="0"/>
-            </w:pPr>
-            <w:r>
-              <w:rPr>
-                <w:color w:val="8C959F"/>
-              </w:rPr>
-              <w:t>[ Pegar aquí la captura de pantalla de Azure DevOps correspondiente ]</w:t>
-            </w:r>
-          </w:p>
-        </w:tc>
-      </w:tr>
-    </w:tbl>
+    <w:p>
+      <w:r>
+        <w:rPr>
+          <w:b/>
+          <w:i w:val="0"/>
+          <w:sz w:val="24"/>
+        </w:rPr>
+        <w:t>Evidencia 4 — Plan de pruebas y suites en Azure Test Plans</w:t>
+      </w:r>
+    </w:p>
+    <w:p>
+      <w:pPr>
+        <w:jc w:val="center"/>
+      </w:pPr>
+      <w:r>
+        <w:drawing>
+          <wp:inline xmlns:a="http://schemas.openxmlformats.org/drawingml/2006/main" xmlns:pic="http://schemas.openxmlformats.org/drawingml/2006/picture">
+            <wp:extent cx="5760720" cy="1159345"/>
+            <wp:docPr id="14" name="Picture 14"/>
+            <wp:cNvGraphicFramePr>
+              <a:graphicFrameLocks noChangeAspect="1"/>
+            </wp:cNvGraphicFramePr>
+            <a:graphic>
+              <a:graphicData uri="http://schemas.openxmlformats.org/drawingml/2006/picture">
+                <pic:pic>
+                  <pic:nvPicPr>
+                    <pic:cNvPr id="0" name="06_testplans_all.png"/>
+                    <pic:cNvPicPr/>
+                  </pic:nvPicPr>
+                  <pic:blipFill>
+                    <a:blip r:embed="rId24"/>
+                    <a:stretch>
+                      <a:fillRect/>
+                    </a:stretch>
+                  </pic:blipFill>
+                  <pic:spPr>
+                    <a:xfrm>
+                      <a:off x="0" y="0"/>
+                      <a:ext cx="5760720" cy="1159345"/>
+                    </a:xfrm>
+                    <a:prstGeom prst="rect"/>
+                  </pic:spPr>
+                </pic:pic>
+              </a:graphicData>
+            </a:graphic>
+          </wp:inline>
+        </w:drawing>
+      </w:r>
+    </w:p>
+    <w:p>
+      <w:pPr>
+        <w:jc w:val="center"/>
+      </w:pPr>
+      <w:r>
+        <w:rPr>
+          <w:b w:val="0"/>
+          <w:i/>
+          <w:sz w:val="18"/>
+        </w:rPr>
+        <w:t>Figura 4a. Test Plans &gt; All: plan "FutsalPro - Ciclo 1" (ID 90), estado Active.</w:t>
+      </w:r>
+    </w:p>
+    <w:p>
+      <w:pPr>
+        <w:jc w:val="center"/>
+      </w:pPr>
+      <w:r>
+        <w:drawing>
+          <wp:inline xmlns:a="http://schemas.openxmlformats.org/drawingml/2006/main" xmlns:pic="http://schemas.openxmlformats.org/drawingml/2006/picture">
+            <wp:extent cx="5760720" cy="1861433"/>
+            <wp:docPr id="15" name="Picture 15"/>
+            <wp:cNvGraphicFramePr>
+              <a:graphicFrameLocks noChangeAspect="1"/>
+            </wp:cNvGraphicFramePr>
+            <a:graphic>
+              <a:graphicData uri="http://schemas.openxmlformats.org/drawingml/2006/picture">
+                <pic:pic>
+                  <pic:nvPicPr>
+                    <pic:cNvPr id="0" name="08_testplan_item90_suites.png"/>
+                    <pic:cNvPicPr/>
+                  </pic:nvPicPr>
+                  <pic:blipFill>
+                    <a:blip r:embed="rId25"/>
+                    <a:stretch>
+                      <a:fillRect/>
+                    </a:stretch>
+                  </pic:blipFill>
+                  <pic:spPr>
+                    <a:xfrm>
+                      <a:off x="0" y="0"/>
+                      <a:ext cx="5760720" cy="1861433"/>
+                    </a:xfrm>
+                    <a:prstGeom prst="rect"/>
+                  </pic:spPr>
+                </pic:pic>
+              </a:graphicData>
+            </a:graphic>
+          </wp:inline>
+        </w:drawing>
+      </w:r>
+    </w:p>
+    <w:p>
+      <w:pPr>
+        <w:jc w:val="center"/>
+      </w:pPr>
+      <w:r>
+        <w:rPr>
+          <w:b w:val="0"/>
+          <w:i/>
+          <w:sz w:val="18"/>
+        </w:rPr>
+        <w:t>Figura 4b. Estructura del plan: suites Unitarias (91), Integración (API) (92) y Aceptación (93).</w:t>
+      </w:r>
+    </w:p>
+    <w:p>
+      <w:r>
+        <w:rPr>
+          <w:b w:val="0"/>
+          <w:i/>
+          <w:sz w:val="18"/>
+        </w:rPr>
+        <w:t>Nota: el plan figura en Test Plans &gt; All con ID 90. El servicio de Test Plans no expone el árbol de suites para este plan; las suites Unitarias, Integración (API) y Aceptación están registradas como work items hijos (91, 92 y 93) y se evidencian en la Figura 4b.</w:t>
+      </w:r>
+    </w:p>
+    <w:p>
+      <w:r>
+        <w:rPr>
+          <w:b w:val="0"/>
+          <w:i w:val="0"/>
+        </w:rPr>
+      </w:r>
+    </w:p>
     <w:p>
       <w:pPr>
         <w:spacing w:after="140" w:line="276" w:lineRule="auto"/>
       </w:pPr>
     </w:p>
-    <w:tbl>
-      <w:tblPr>
-        <w:tblW w:w="9360" w:type="dxa"/>
-        <w:tblBorders>
-          <w:top w:val="dashed" w:sz="12" w:space="0" w:color="0078D4"/>
-          <w:left w:val="dashed" w:sz="12" w:space="0" w:color="0078D4"/>
-          <w:bottom w:val="dashed" w:sz="12" w:space="0" w:color="0078D4"/>
-          <w:right w:val="dashed" w:sz="12" w:space="0" w:color="0078D4"/>
-          <w:insideH w:val="none"/>
-          <w:insideV w:val="none"/>
-        </w:tblBorders>
-      </w:tblPr>
-      <w:tr>
-        <w:tc>
-          <w:tcPr>
-            <w:tcW w:w="9360" w:type="dxa"/>
-            <w:shd w:val="clear" w:color="auto" w:fill="F0F6FC"/>
-            <w:tcMar>
-              <w:top w:w="240" w:type="dxa"/>
-              <w:bottom w:w="240" w:type="dxa"/>
-              <w:left w:w="300" w:type="dxa"/>
-              <w:right w:w="300" w:type="dxa"/>
-            </w:tcMar>
-          </w:tcPr>
-          <w:p>
-            <w:pPr>
-              <w:jc w:val="center"/>
-              <w:spacing w:after="80"/>
-            </w:pPr>
-            <w:r>
-              <w:rPr>
-                <w:b/>
-                <w:color w:val="005A9E"/>
-                <w:sz w:val="22"/>
-              </w:rPr>
-              <w:t>[ 📷 ESPACIO PARA CAPTURA 5: TABLERO SCRUM (TASKBOARD) Y MATRIZ DE EJECUCIÓN DE PRUEBAS ]</w:t>
-            </w:r>
-          </w:p>
-          <w:p>
-            <w:pPr>
-              <w:jc w:val="center"/>
-              <w:spacing w:after="60"/>
-            </w:pPr>
-            <w:r>
-              <w:rPr>
-                <w:i/>
-                <w:color w:val="24292F"/>
-              </w:rPr>
-              <w:t>Tablero Scrum mostrando el progreso de las tareas de testing asignadas a los 4 integrantes (To Do, In Progress, Done) y Test Runs.</w:t>
-            </w:r>
-          </w:p>
-          <w:p>
-            <w:pPr>
-              <w:jc w:val="center"/>
-              <w:spacing w:after="80"/>
-            </w:pPr>
-            <w:r>
-              <w:rPr>
-                <w:b/>
-                <w:color w:val="0969DA"/>
-              </w:rPr>
-              <w:t>👤 Integrante Responsable: CARLOS PÉREZ / DAX ASCENCIO / ANDERSON PINEDA / FRANKLIN PÉREZ</w:t>
-            </w:r>
-          </w:p>
-          <w:p>
-            <w:pPr>
-              <w:jc w:val="center"/>
-              <w:spacing w:after="160"/>
-            </w:pPr>
-            <w:r>
-              <w:rPr>
-                <w:color w:val="57606A"/>
-                <w:sz w:val="18"/>
-              </w:rPr>
-              <w:t>Instrucción para el equipo: Ir a Azure DevOps &gt; Boards &gt; Sprints &gt; Taskboard. Capturar el tablero con las tareas de testing completadas por el equipo.</w:t>
-            </w:r>
-          </w:p>
-          <w:p>
-            <w:pPr>
-              <w:jc w:val="center"/>
-              <w:spacing w:after="0"/>
-            </w:pPr>
-            <w:r>
-              <w:rPr>
-                <w:color w:val="8C959F"/>
-              </w:rPr>
-              <w:t>[ Pegar aquí la captura de pantalla de Azure DevOps correspondiente ]</w:t>
-            </w:r>
-          </w:p>
-        </w:tc>
-      </w:tr>
-    </w:tbl>
+    <w:p>
+      <w:r>
+        <w:rPr>
+          <w:b/>
+          <w:i w:val="0"/>
+          <w:sz w:val="24"/>
+        </w:rPr>
+        <w:t>Evidencia 5 — Taskboard Scrum del Sprint 1</w:t>
+      </w:r>
+    </w:p>
+    <w:p>
+      <w:pPr>
+        <w:jc w:val="center"/>
+      </w:pPr>
+      <w:r>
+        <w:drawing>
+          <wp:inline xmlns:a="http://schemas.openxmlformats.org/drawingml/2006/main" xmlns:pic="http://schemas.openxmlformats.org/drawingml/2006/picture">
+            <wp:extent cx="5760720" cy="4663440"/>
+            <wp:docPr id="16" name="Picture 16"/>
+            <wp:cNvGraphicFramePr>
+              <a:graphicFrameLocks noChangeAspect="1"/>
+            </wp:cNvGraphicFramePr>
+            <a:graphic>
+              <a:graphicData uri="http://schemas.openxmlformats.org/drawingml/2006/picture">
+                <pic:pic>
+                  <pic:nvPicPr>
+                    <pic:cNvPr id="0" name="07_taskboard_sprint1.png"/>
+                    <pic:cNvPicPr/>
+                  </pic:nvPicPr>
+                  <pic:blipFill>
+                    <a:blip r:embed="rId26"/>
+                    <a:stretch>
+                      <a:fillRect/>
+                    </a:stretch>
+                  </pic:blipFill>
+                  <pic:spPr>
+                    <a:xfrm>
+                      <a:off x="0" y="0"/>
+                      <a:ext cx="5760720" cy="4663440"/>
+                    </a:xfrm>
+                    <a:prstGeom prst="rect"/>
+                  </pic:spPr>
+                </pic:pic>
+              </a:graphicData>
+            </a:graphic>
+          </wp:inline>
+        </w:drawing>
+      </w:r>
+    </w:p>
+    <w:p>
+      <w:pPr>
+        <w:jc w:val="center"/>
+      </w:pPr>
+      <w:r>
+        <w:rPr>
+          <w:b w:val="0"/>
+          <w:i/>
+          <w:sz w:val="18"/>
+        </w:rPr>
+        <w:t>Figura 5. Taskboard del Sprint 1: tareas de prueba en To Do, In Progress y Done por integrante.</w:t>
+      </w:r>
+    </w:p>
+    <w:p>
+      <w:r>
+        <w:rPr>
+          <w:b w:val="0"/>
+          <w:i w:val="0"/>
+        </w:rPr>
+      </w:r>
+    </w:p>
     <w:p>
       <w:pPr>
         <w:spacing w:after="180" w:line="276" w:lineRule="auto"/>

</xml_diff>